<commit_message>
First client kit: 20 providers for week one, personal emails, playbook, follow-up import; correct Conduct Regulations references
Co-Authored-By: Claude Opus 5.5 <noreply@anthropic.com>
Claude-Session: https://claude.ai/code/session_01XByJMQfkaq2do2XmLu4Dhj
</commit_message>
<xml_diff>
--- a/documents/Haverton Recruitment/1 Start Here/Launch Checklist.docx
+++ b/documents/Haverton Recruitment/1 Start Here/Launch Checklist.docx
@@ -265,7 +265,7 @@
               <w:spacing w:after="40" w:line="270"/>
             </w:pPr>
             <w:r>
-              <w:t xml:space="preserve">Legal requirement: terms agreed with clients before services (Conduct Regulations reg 16)</w:t>
+              <w:t xml:space="preserve">Commercial necessity: makes your fee and guarantee enforceable (no statutory rule for permanent recruitment since 2016)</w:t>
             </w:r>
           </w:p>
         </w:tc>
@@ -374,7 +374,7 @@
               <w:spacing w:after="40" w:line="270"/>
             </w:pPr>
             <w:r>
-              <w:t xml:space="preserve">Legal requirement: terms agreed with candidates (reg 14)</w:t>
+              <w:t xml:space="preserve">Legal requirement: tell candidates the service is free (Conduct Regulations reg 13). Written worker terms are required for temporary work (reg 14)</w:t>
             </w:r>
           </w:p>
         </w:tc>

</xml_diff>